<commit_message>
Add GitHub screenshot to Module 5.2 document
</commit_message>
<xml_diff>
--- a/module-5/Shrestha_Module_5.2_Screenshots.docx
+++ b/module-5/Shrestha_Module_5.2_Screenshots.docx
@@ -34,7 +34,6 @@
         <w:t>October 11, 2026</w:t>
       </w:r>
     </w:p>
-    <w:p/>
     <w:p>
       <w:pPr>
         <w:pStyle w:val="Heading1"/>
@@ -54,7 +53,28 @@
         <w:t>,</w:t>
       </w:r>
       <w:r>
-        <w:t xml:space="preserve"> I wrote WordSorter.java, which reads the words in collection_of_words.txt, removes the duplicates by storing them in a TreeSet, and prints the unique words in ascending order and then in descending order using descendingSet(). I also wrote WordSorterTest.java, which runs ten tests to check duplicate removal, upper and lower case, punctuation, both sort orders, and reading the word file. Four of the tests check error handling: a missing file, an empty file, a null file, and a null line. Every caught exception is printed to the console and recorded with a Logger</w:t>
+        <w:t xml:space="preserve"> I wrote WordSorter.java, which reads the words in collection_of_words.txt, removes the duplicates by storing them in a </w:t>
+      </w:r>
+      <w:proofErr w:type="spellStart"/>
+      <w:proofErr w:type="gramStart"/>
+      <w:r>
+        <w:t>TreeSet</w:t>
+      </w:r>
+      <w:proofErr w:type="spellEnd"/>
+      <w:r>
+        <w:t>, and</w:t>
+      </w:r>
+      <w:proofErr w:type="gramEnd"/>
+      <w:r>
+        <w:t xml:space="preserve"> prints the unique words in ascending order and then in descending order using descendingSet(). I also wrote WordSorterTest.java, which runs ten tests to check duplicate removal, upper and lower case, punctuation, both sort orders, and reading the word file. Four of the tests check error handling: a missing file, an empty file, a null file, and a null line. Every caught exception is printed </w:t>
+      </w:r>
+      <w:proofErr w:type="gramStart"/>
+      <w:r>
+        <w:t>to</w:t>
+      </w:r>
+      <w:proofErr w:type="gramEnd"/>
+      <w:r>
+        <w:t xml:space="preserve"> the console and recorded with a Logger</w:t>
       </w:r>
       <w:r>
         <w:t xml:space="preserve"> as shown in the </w:t>
@@ -93,8 +113,8 @@
           <w:color w:val="808080"/>
         </w:rPr>
         <w:drawing>
-          <wp:inline distT="0" distB="0" distL="0" distR="0" wp14:anchorId="371BCAB3" wp14:editId="34CED627">
-            <wp:extent cx="4581525" cy="1525213"/>
+          <wp:inline distT="0" distB="0" distL="0" distR="0" wp14:anchorId="371BCAB3" wp14:editId="243F7D68">
+            <wp:extent cx="4881563" cy="1625097"/>
             <wp:effectExtent l="0" t="0" r="0" b="0"/>
             <wp:docPr id="1" name="Picture 1"/>
             <wp:cNvGraphicFramePr>
@@ -116,7 +136,7 @@
                   <pic:spPr>
                     <a:xfrm>
                       <a:off x="0" y="0"/>
-                      <a:ext cx="4674193" cy="1556063"/>
+                      <a:ext cx="5016405" cy="1669987"/>
                     </a:xfrm>
                     <a:prstGeom prst="rect">
                       <a:avLst/>
@@ -142,7 +162,23 @@
           <w:i/>
           <w:sz w:val="20"/>
         </w:rPr>
-        <w:t>Figure 1. Java 25.0.4.1 runtime and compiler installed, verified with java -version and javac -version in PowerShell.</w:t>
+        <w:t xml:space="preserve">Figure 1. Java 25.0.4.1 runtime and compiler installed, verified with java -version and </w:t>
+      </w:r>
+      <w:proofErr w:type="spellStart"/>
+      <w:r>
+        <w:rPr>
+          <w:i/>
+          <w:sz w:val="20"/>
+        </w:rPr>
+        <w:t>javac</w:t>
+      </w:r>
+      <w:proofErr w:type="spellEnd"/>
+      <w:r>
+        <w:rPr>
+          <w:i/>
+          <w:sz w:val="20"/>
+        </w:rPr>
+        <w:t xml:space="preserve"> -version in PowerShell.</w:t>
       </w:r>
     </w:p>
     <w:p>
@@ -161,9 +197,9 @@
           <w:color w:val="808080"/>
         </w:rPr>
         <w:drawing>
-          <wp:inline distT="0" distB="0" distL="0" distR="0" wp14:anchorId="574D57C6" wp14:editId="62164991">
-            <wp:extent cx="3422787" cy="1847850"/>
-            <wp:effectExtent l="0" t="0" r="6350" b="0"/>
+          <wp:inline distT="0" distB="0" distL="0" distR="0" wp14:anchorId="574D57C6" wp14:editId="61BE2D2A">
+            <wp:extent cx="3819759" cy="2062162"/>
+            <wp:effectExtent l="0" t="0" r="0" b="0"/>
             <wp:docPr id="2" name="Picture 2"/>
             <wp:cNvGraphicFramePr>
               <a:graphicFrameLocks xmlns:a="http://schemas.openxmlformats.org/drawingml/2006/main" noChangeAspect="1"/>
@@ -184,7 +220,7 @@
                   <pic:spPr>
                     <a:xfrm>
                       <a:off x="0" y="0"/>
-                      <a:ext cx="3562766" cy="1923420"/>
+                      <a:ext cx="3999236" cy="2159056"/>
                     </a:xfrm>
                     <a:prstGeom prst="rect">
                       <a:avLst/>
@@ -210,7 +246,24 @@
           <w:i/>
           <w:sz w:val="20"/>
         </w:rPr>
-        <w:t>Figure 2. JavaFX SDK 25.0.4 configured as a global library in IntelliJ IDEA.</w:t>
+        <w:lastRenderedPageBreak/>
+        <w:t xml:space="preserve">Figure 2. JavaFX SDK 25.0.4 </w:t>
+      </w:r>
+      <w:proofErr w:type="gramStart"/>
+      <w:r>
+        <w:rPr>
+          <w:i/>
+          <w:sz w:val="20"/>
+        </w:rPr>
+        <w:t>configured</w:t>
+      </w:r>
+      <w:proofErr w:type="gramEnd"/>
+      <w:r>
+        <w:rPr>
+          <w:i/>
+          <w:sz w:val="20"/>
+        </w:rPr>
+        <w:t xml:space="preserve"> as a global library in IntelliJ IDEA.</w:t>
       </w:r>
     </w:p>
     <w:p>
@@ -218,7 +271,6 @@
         <w:pStyle w:val="Heading2"/>
       </w:pPr>
       <w:r>
-        <w:lastRenderedPageBreak/>
         <w:t>2. WordSorter Program Output</w:t>
       </w:r>
     </w:p>
@@ -389,7 +441,15 @@
         <w:jc w:val="both"/>
       </w:pPr>
       <w:r>
-        <w:t>I also ran WordSorter once without collection_of_words.txt in the project folder to check the error handling. The program did not crash. It printed a clear error message to the console, and the Logger recorded the FileNotFoundException with its details.</w:t>
+        <w:t xml:space="preserve">I also ran </w:t>
+      </w:r>
+      <w:proofErr w:type="spellStart"/>
+      <w:r>
+        <w:t>WordSorter</w:t>
+      </w:r>
+      <w:proofErr w:type="spellEnd"/>
+      <w:r>
+        <w:t xml:space="preserve"> once without collection_of_words.txt in the project folder to check the error handling. The program did not crash. It printed a clear error message to the console, and the Logger recorded the FileNotFoundException with its details.</w:t>
       </w:r>
     </w:p>
     <w:p>
@@ -444,10 +504,6 @@
     <w:p>
       <w:pPr>
         <w:jc w:val="center"/>
-        <w:rPr>
-          <w:i/>
-          <w:sz w:val="20"/>
-        </w:rPr>
       </w:pPr>
       <w:r>
         <w:rPr>
@@ -457,7 +513,6 @@
         <w:t>Figure 5. Error handling when collection_of_words.txt is missing: the message is printed to the console and the exception is logged.</w:t>
       </w:r>
     </w:p>
-    <w:p/>
     <w:p>
       <w:pPr>
         <w:pStyle w:val="Heading2"/>
@@ -473,13 +528,18 @@
       <w:r>
         <w:t>The code, the word file, and this document were pushed to my CSD-420 repository in the module-5 folder.</w:t>
       </w:r>
-    </w:p>
-    <w:p>
-      <w:pPr>
-        <w:jc w:val="both"/>
-      </w:pPr>
       <w:r>
-        <w:t>GitHub repository: https://github.com/RockyShrestha/csd-420</w:t>
+        <w:t xml:space="preserve">  </w:t>
+      </w:r>
+      <w:r>
+        <w:rPr>
+          <w:b/>
+          <w:bCs/>
+        </w:rPr>
+        <w:t>GitHub repository:</w:t>
+      </w:r>
+      <w:r>
+        <w:t xml:space="preserve"> https://github.com/RockyShrestha/csd-420</w:t>
       </w:r>
     </w:p>
     <w:p>
@@ -493,9 +553,44 @@
       <w:r>
         <w:rPr>
           <w:i/>
+          <w:noProof/>
           <w:sz w:val="20"/>
         </w:rPr>
-        <w:t>---</w:t>
+        <w:drawing>
+          <wp:inline distT="0" distB="0" distL="0" distR="0" wp14:anchorId="2F5D428C" wp14:editId="72F9AED6">
+            <wp:extent cx="4429125" cy="2587244"/>
+            <wp:effectExtent l="0" t="0" r="0" b="3810"/>
+            <wp:docPr id="1042819228" name="Picture 1"/>
+            <wp:cNvGraphicFramePr>
+              <a:graphicFrameLocks xmlns:a="http://schemas.openxmlformats.org/drawingml/2006/main" noChangeAspect="1"/>
+            </wp:cNvGraphicFramePr>
+            <a:graphic xmlns:a="http://schemas.openxmlformats.org/drawingml/2006/main">
+              <a:graphicData uri="http://schemas.openxmlformats.org/drawingml/2006/picture">
+                <pic:pic xmlns:pic="http://schemas.openxmlformats.org/drawingml/2006/picture">
+                  <pic:nvPicPr>
+                    <pic:cNvPr id="1042819228" name=""/>
+                    <pic:cNvPicPr/>
+                  </pic:nvPicPr>
+                  <pic:blipFill>
+                    <a:blip r:embed="rId11"/>
+                    <a:stretch>
+                      <a:fillRect/>
+                    </a:stretch>
+                  </pic:blipFill>
+                  <pic:spPr>
+                    <a:xfrm>
+                      <a:off x="0" y="0"/>
+                      <a:ext cx="4455662" cy="2602746"/>
+                    </a:xfrm>
+                    <a:prstGeom prst="rect">
+                      <a:avLst/>
+                    </a:prstGeom>
+                  </pic:spPr>
+                </pic:pic>
+              </a:graphicData>
+            </a:graphic>
+          </wp:inline>
+        </w:drawing>
       </w:r>
     </w:p>
     <w:p>
@@ -513,6 +608,15 @@
         </w:rPr>
         <w:t>Figure 6. Module 5.2 files pushed to the csd-420 GitHub repository.</w:t>
       </w:r>
+    </w:p>
+    <w:p>
+      <w:pPr>
+        <w:jc w:val="center"/>
+        <w:rPr>
+          <w:i/>
+          <w:sz w:val="20"/>
+        </w:rPr>
+      </w:pPr>
     </w:p>
     <w:p>
       <w:pPr>

</xml_diff>

<commit_message>
Keeping screenshots and captions on the same page
</commit_message>
<xml_diff>
--- a/module-5/Shrestha_Module_5.2_Screenshots.docx
+++ b/module-5/Shrestha_Module_5.2_Screenshots.docx
@@ -34,6 +34,7 @@
         <w:t>October 11, 2026</w:t>
       </w:r>
     </w:p>
+    <w:p/>
     <w:p>
       <w:pPr>
         <w:pStyle w:val="Heading1"/>
@@ -104,6 +105,7 @@
     </w:p>
     <w:p>
       <w:pPr>
+        <w:keepNext/>
         <w:jc w:val="center"/>
       </w:pPr>
       <w:r>
@@ -113,8 +115,8 @@
           <w:color w:val="808080"/>
         </w:rPr>
         <w:drawing>
-          <wp:inline distT="0" distB="0" distL="0" distR="0" wp14:anchorId="371BCAB3" wp14:editId="243F7D68">
-            <wp:extent cx="4881563" cy="1625097"/>
+          <wp:inline distT="0" distB="0" distL="0" distR="0" wp14:anchorId="371BCAB3" wp14:editId="34CED627">
+            <wp:extent cx="4581525" cy="1525213"/>
             <wp:effectExtent l="0" t="0" r="0" b="0"/>
             <wp:docPr id="1" name="Picture 1"/>
             <wp:cNvGraphicFramePr>
@@ -136,7 +138,7 @@
                   <pic:spPr>
                     <a:xfrm>
                       <a:off x="0" y="0"/>
-                      <a:ext cx="5016405" cy="1669987"/>
+                      <a:ext cx="4674193" cy="1556063"/>
                     </a:xfrm>
                     <a:prstGeom prst="rect">
                       <a:avLst/>
@@ -151,6 +153,7 @@
     </w:p>
     <w:p>
       <w:pPr>
+        <w:keepLines/>
         <w:jc w:val="center"/>
         <w:rPr>
           <w:i/>
@@ -188,6 +191,7 @@
     </w:p>
     <w:p>
       <w:pPr>
+        <w:keepNext/>
         <w:jc w:val="center"/>
       </w:pPr>
       <w:r>
@@ -197,9 +201,9 @@
           <w:color w:val="808080"/>
         </w:rPr>
         <w:drawing>
-          <wp:inline distT="0" distB="0" distL="0" distR="0" wp14:anchorId="574D57C6" wp14:editId="61BE2D2A">
-            <wp:extent cx="3819759" cy="2062162"/>
-            <wp:effectExtent l="0" t="0" r="0" b="0"/>
+          <wp:inline distT="0" distB="0" distL="0" distR="0" wp14:anchorId="574D57C6" wp14:editId="62164991">
+            <wp:extent cx="3422787" cy="1847850"/>
+            <wp:effectExtent l="0" t="0" r="6350" b="0"/>
             <wp:docPr id="2" name="Picture 2"/>
             <wp:cNvGraphicFramePr>
               <a:graphicFrameLocks xmlns:a="http://schemas.openxmlformats.org/drawingml/2006/main" noChangeAspect="1"/>
@@ -220,7 +224,7 @@
                   <pic:spPr>
                     <a:xfrm>
                       <a:off x="0" y="0"/>
-                      <a:ext cx="3999236" cy="2159056"/>
+                      <a:ext cx="3562766" cy="1923420"/>
                     </a:xfrm>
                     <a:prstGeom prst="rect">
                       <a:avLst/>
@@ -235,6 +239,7 @@
     </w:p>
     <w:p>
       <w:pPr>
+        <w:keepLines/>
         <w:jc w:val="center"/>
         <w:rPr>
           <w:i/>
@@ -246,7 +251,6 @@
           <w:i/>
           <w:sz w:val="20"/>
         </w:rPr>
-        <w:lastRenderedPageBreak/>
         <w:t xml:space="preserve">Figure 2. JavaFX SDK 25.0.4 </w:t>
       </w:r>
       <w:proofErr w:type="gramStart"/>
@@ -271,6 +275,7 @@
         <w:pStyle w:val="Heading2"/>
       </w:pPr>
       <w:r>
+        <w:lastRenderedPageBreak/>
         <w:t>2. WordSorter Program Output</w:t>
       </w:r>
     </w:p>
@@ -337,6 +342,7 @@
     </w:p>
     <w:p>
       <w:pPr>
+        <w:keepLines/>
         <w:jc w:val="center"/>
         <w:rPr>
           <w:i/>
@@ -422,6 +428,7 @@
     </w:p>
     <w:p>
       <w:pPr>
+        <w:keepLines/>
         <w:jc w:val="center"/>
         <w:rPr>
           <w:i/>
@@ -454,6 +461,7 @@
     </w:p>
     <w:p>
       <w:pPr>
+        <w:keepNext/>
         <w:jc w:val="center"/>
         <w:rPr>
           <w:i/>
@@ -503,6 +511,7 @@
     </w:p>
     <w:p>
       <w:pPr>
+        <w:keepLines/>
         <w:jc w:val="center"/>
       </w:pPr>
       <w:r>
@@ -544,6 +553,7 @@
     </w:p>
     <w:p>
       <w:pPr>
+        <w:keepNext/>
         <w:jc w:val="center"/>
         <w:rPr>
           <w:i/>
@@ -595,6 +605,7 @@
     </w:p>
     <w:p>
       <w:pPr>
+        <w:keepLines/>
         <w:jc w:val="center"/>
         <w:rPr>
           <w:i/>

</xml_diff>